<commit_message>
Uploading a new file
</commit_message>
<xml_diff>
--- a/src/devotionals/June 16, 2026.docx
+++ b/src/devotionals/June 16, 2026.docx
@@ -12,7 +12,7 @@
         <w:rPr>
           <w:rFonts w:ascii="Sitka Banner Semibold" w:hAnsi="Sitka Banner Semibold"/>
         </w:rPr>
-        <w:t>June 16, 2026</w:t>
+        <w:t>September 20, 2026</w:t>
       </w:r>
     </w:p>
     <w:p>
@@ -37,13 +37,7 @@
         <w:rPr>
           <w:rFonts w:ascii="Sitka Banner Semibold" w:hAnsi="Sitka Banner Semibold"/>
         </w:rPr>
-        <w:t>e said to me,</w:t>
-      </w:r>
-      <w:r>
-        <w:rPr>
-          <w:rFonts w:ascii="Sitka Banner Semibold" w:hAnsi="Sitka Banner Semibold"/>
-        </w:rPr>
-        <w:t xml:space="preserve"> </w:t>
+        <w:t xml:space="preserve">e said to me, </w:t>
       </w:r>
       <w:r>
         <w:rPr>
@@ -116,7 +110,21 @@
         <w:rPr>
           <w:rFonts w:ascii="Sitka Display" w:hAnsi="Sitka Display"/>
         </w:rPr>
-        <w:t xml:space="preserve">.” Meanwhile, the phrase “made perfect” is directly translated as “bring to a close/end” or “perform, execute, complete, or fulfill.” The word “weakness” is actually a want of strength and spiritual capacity to do something, likely here restraining corrupt desires and/or bear trials and troubles. I find “boast” to be a very interesting choice here. It is, I think, the best word that will be understood broadly, but is missing quite a bit of nuance compared to the direct translation “to glory in a thing.” To boast of one’s weakness is different than glorying in it. The definition of “glory” as a verb is to “rejoice loudly or exult with joy” whereas “boast” is defined as praising oneself extravagantly in speech/speak of oneself with excessive pride.” These are different words with different connotations. Paul isn’t saying that he is </w:t>
+        <w:t xml:space="preserve">.” Meanwhile, the phrase “made perfect” is directly translated as “bring to a close/end” or “perform, execute, complete, or fulfill.” The word “weakness” is </w:t>
+      </w:r>
+      <w:proofErr w:type="gramStart"/>
+      <w:r>
+        <w:rPr>
+          <w:rFonts w:ascii="Sitka Display" w:hAnsi="Sitka Display"/>
+        </w:rPr>
+        <w:t>actually a</w:t>
+      </w:r>
+      <w:proofErr w:type="gramEnd"/>
+      <w:r>
+        <w:rPr>
+          <w:rFonts w:ascii="Sitka Display" w:hAnsi="Sitka Display"/>
+        </w:rPr>
+        <w:t xml:space="preserve"> want of strength and spiritual capacity to do something, likely here restraining corrupt desires and/or bear trials and troubles. I find “boast” to be a very interesting choice here. It is, I think, the best word that will be understood broadly, but is missing quite a bit of nuance compared to the direct translation “to glory in a thing.” To boast of one’s weakness is different than glorying in it. The definition of “glory” as a verb is to “rejoice loudly or exult with joy” whereas “boast” is defined as praising oneself extravagantly in speech/speak of oneself with excessive pride.” These are different words with different connotations. Paul isn’t saying that he is </w:t>
       </w:r>
       <w:r>
         <w:rPr>
@@ -162,7 +170,35 @@
         <w:rPr>
           <w:rFonts w:ascii="Sitka Display" w:hAnsi="Sitka Display"/>
         </w:rPr>
-        <w:t xml:space="preserve">to fix a tent or habitation on.” Again, yes, these words are functionally similar, but nuance is missing in the translation. The image of Christ fixing a habitation within us feels personal. Permanent. I “reside” in an Airbnb on vacation, but that requires no work and I can leave with barely more than a thought. However, if I go camping, I pitch a tent. That requires time, effort, planning, and intentionality. And to leave, I must either leave it there as a permanent fixture to come back to. A fixture I own and am responsible for, or I must take it down, which requires a great deal of effort. Again, the idea of pitching a tent is more permanent and intentional than just residing somewhere. So, if we were to look at this verse with those key words utilizing their direct definitions, it would look like this: “But He said to me, ‘My grace is unfailing and enough for you, for my power is completed and fulfilled in your want of the strength to withstand this trouble.’ So then, I will exult in my desire for greater spiritual capacity, so that the power of Christ may build itself a home in me.” This, I think, clearly outlines the meaning </w:t>
+        <w:t xml:space="preserve">to fix a tent or habitation on.” Again, yes, these words are functionally similar, but nuance is missing in the translation. The image of Christ fixing a habitation within us feels personal. Permanent. I “reside” in an Airbnb on vacation, but that requires no work and I can leave with barely more than a thought. However, if I go camping, I pitch a tent. That requires time, effort, planning, and intentionality. And to leave, I must either leave it there as a permanent fixture to come back to. A fixture I own and am responsible for, or I must take it down, which requires a great deal of effort. Again, the idea of </w:t>
+      </w:r>
+      <w:proofErr w:type="gramStart"/>
+      <w:r>
+        <w:rPr>
+          <w:rFonts w:ascii="Sitka Display" w:hAnsi="Sitka Display"/>
+        </w:rPr>
+        <w:t>pitching</w:t>
+      </w:r>
+      <w:proofErr w:type="gramEnd"/>
+      <w:r>
+        <w:rPr>
+          <w:rFonts w:ascii="Sitka Display" w:hAnsi="Sitka Display"/>
+        </w:rPr>
+        <w:t xml:space="preserve"> a tent is more permanent and intentional than just </w:t>
+      </w:r>
+      <w:proofErr w:type="gramStart"/>
+      <w:r>
+        <w:rPr>
+          <w:rFonts w:ascii="Sitka Display" w:hAnsi="Sitka Display"/>
+        </w:rPr>
+        <w:t>residing</w:t>
+      </w:r>
+      <w:proofErr w:type="gramEnd"/>
+      <w:r>
+        <w:rPr>
+          <w:rFonts w:ascii="Sitka Display" w:hAnsi="Sitka Display"/>
+        </w:rPr>
+        <w:t xml:space="preserve"> somewhere. So, if we were to look at this verse with those key words utilizing their direct definitions, it would look like this: “But He said to me, ‘My grace is unfailing and enough for you, for my power is completed and fulfilled in your want of the strength to withstand this trouble.’ So then, I will exult in my desire for greater spiritual capacity, so that the power of Christ may build itself a home in me.” This, I think, clearly outlines the meaning </w:t>
       </w:r>
       <w:r>
         <w:rPr>
@@ -213,13 +249,69 @@
           <w:rFonts w:ascii="Sitka Display" w:hAnsi="Sitka Display"/>
         </w:rPr>
         <w:lastRenderedPageBreak/>
-        <w:t xml:space="preserve">Christ into us so that he may build a dwelling place within our souls. I think the key take away here is as follows: Do not hide your sin and weaknesses. Your “thorns.” Instead, bring them to G-d </w:t>
-      </w:r>
-      <w:r>
-        <w:rPr>
-          <w:rFonts w:ascii="Sitka Display" w:hAnsi="Sitka Display"/>
-        </w:rPr>
-        <w:t xml:space="preserve">and try to be excited for the opportunity they provide for G-d to transform you and provide you the capacity to bear the burdens you carry. They are a pathway carved to your heart that Christ is able to easily travel. If we invite Him in, He </w:t>
+        <w:t xml:space="preserve">Christ into us so that he may build a dwelling place within our souls. I think the key </w:t>
+      </w:r>
+      <w:proofErr w:type="gramStart"/>
+      <w:r>
+        <w:rPr>
+          <w:rFonts w:ascii="Sitka Display" w:hAnsi="Sitka Display"/>
+        </w:rPr>
+        <w:t>take</w:t>
+      </w:r>
+      <w:proofErr w:type="gramEnd"/>
+      <w:r>
+        <w:rPr>
+          <w:rFonts w:ascii="Sitka Display" w:hAnsi="Sitka Display"/>
+        </w:rPr>
+        <w:t xml:space="preserve"> away here is as follows: Do not hide your sin and weaknesses. Your “thorns.” Instead, bring them to G-d </w:t>
+      </w:r>
+      <w:r>
+        <w:rPr>
+          <w:rFonts w:ascii="Sitka Display" w:hAnsi="Sitka Display"/>
+        </w:rPr>
+        <w:t xml:space="preserve">and try to be excited </w:t>
+      </w:r>
+      <w:proofErr w:type="gramStart"/>
+      <w:r>
+        <w:rPr>
+          <w:rFonts w:ascii="Sitka Display" w:hAnsi="Sitka Display"/>
+        </w:rPr>
+        <w:t>for</w:t>
+      </w:r>
+      <w:proofErr w:type="gramEnd"/>
+      <w:r>
+        <w:rPr>
+          <w:rFonts w:ascii="Sitka Display" w:hAnsi="Sitka Display"/>
+        </w:rPr>
+        <w:t xml:space="preserve"> the opportunity they provide for G-d to transform you and provide </w:t>
+      </w:r>
+      <w:proofErr w:type="gramStart"/>
+      <w:r>
+        <w:rPr>
+          <w:rFonts w:ascii="Sitka Display" w:hAnsi="Sitka Display"/>
+        </w:rPr>
+        <w:t>you</w:t>
+      </w:r>
+      <w:proofErr w:type="gramEnd"/>
+      <w:r>
+        <w:rPr>
+          <w:rFonts w:ascii="Sitka Display" w:hAnsi="Sitka Display"/>
+        </w:rPr>
+        <w:t xml:space="preserve"> the capacity to bear the burdens you carry. They are a pathway carved to your heart that Christ </w:t>
+      </w:r>
+      <w:proofErr w:type="gramStart"/>
+      <w:r>
+        <w:rPr>
+          <w:rFonts w:ascii="Sitka Display" w:hAnsi="Sitka Display"/>
+        </w:rPr>
+        <w:t>is able to</w:t>
+      </w:r>
+      <w:proofErr w:type="gramEnd"/>
+      <w:r>
+        <w:rPr>
+          <w:rFonts w:ascii="Sitka Display" w:hAnsi="Sitka Display"/>
+        </w:rPr>
+        <w:t xml:space="preserve"> easily travel. If we invite Him in, He </w:t>
       </w:r>
       <w:r>
         <w:rPr>
@@ -247,7 +339,21 @@
         <w:rPr>
           <w:rFonts w:ascii="Sitka Display" w:hAnsi="Sitka Display"/>
         </w:rPr>
-        <w:t>help us. And for those of you thinking “but who am I that He would do anything for me.” It isn’t about you. It is about His glory. HIS power is fulfilled by doing this. He is demonstrating the completeness of His own power through you. So take some time today to take Christ a thorn in your side. Sit with Him and rejoice about the thorn. Invite Him in to transform your heart and grant you the strength you need to withstand it.</w:t>
+        <w:t xml:space="preserve">help us. And for those of you thinking “but who am I that He would do anything for me.” It isn’t about you. It is about His glory. HIS power is fulfilled by doing this. He is demonstrating the completeness of His own power through you. </w:t>
+      </w:r>
+      <w:proofErr w:type="gramStart"/>
+      <w:r>
+        <w:rPr>
+          <w:rFonts w:ascii="Sitka Display" w:hAnsi="Sitka Display"/>
+        </w:rPr>
+        <w:t>So</w:t>
+      </w:r>
+      <w:proofErr w:type="gramEnd"/>
+      <w:r>
+        <w:rPr>
+          <w:rFonts w:ascii="Sitka Display" w:hAnsi="Sitka Display"/>
+        </w:rPr>
+        <w:t xml:space="preserve"> take some time today to take Christ a thorn in your side. Sit with Him and rejoice about the thorn. Invite Him in to transform your heart and grant you the strength you need to withstand it.</w:t>
       </w:r>
       <w:r>
         <w:rPr>
@@ -869,6 +975,7 @@
   <w:style w:type="character" w:default="1" w:styleId="DefaultParagraphFont">
     <w:name w:val="Default Paragraph Font"/>
     <w:uiPriority w:val="1"/>
+    <w:semiHidden/>
     <w:unhideWhenUsed/>
   </w:style>
   <w:style w:type="table" w:default="1" w:styleId="TableNormal">

</xml_diff>